<commit_message>
feat: Update resume with immediate joiner status and project end dates, generating new DOCX and PDF outputs.
</commit_message>
<xml_diff>
--- a/output/KiranTilekar_SpringBoot_3.3Yrs.docx
+++ b/output/KiranTilekar_SpringBoot_3.3Yrs.docx
@@ -31,7 +31,7 @@
           <w:sz w:val="20"/>
           <w:szCs w:val="20"/>
         </w:rPr>
-        <w:t xml:space="preserve">Senior Java Developer | Spring Boot 3.x | Monolithic Architecture | 99.9% Uptime | Rs.156Cr+ Systems | 3.3+ Yrs</w:t>
+        <w:t xml:space="preserve">Senior Java Developer | Spring Boot 3.x | Monolithic Architecture | 99.9% Uptime | Rs.156Cr+ Systems | 3.3+ Yrs | Immediate Joiner</w:t>
       </w:r>
     </w:p>
     <w:p>
@@ -538,7 +538,7 @@
           <w:sz w:val="20"/>
           <w:szCs w:val="20"/>
         </w:rPr>
-        <w:t xml:space="preserve">  |  Nov 2022 – Present</w:t>
+        <w:t xml:space="preserve">  |  Nov 2022 – 31 Jan 2026</w:t>
       </w:r>
       <w:r>
         <w:rPr>
@@ -1088,7 +1088,7 @@
           <w:sz w:val="20"/>
           <w:szCs w:val="20"/>
         </w:rPr>
-        <w:t xml:space="preserve">  |  Feb 2023 – Present</w:t>
+        <w:t xml:space="preserve">  |  Feb 2023 – 31 Jan 2026</w:t>
       </w:r>
     </w:p>
     <w:p>
@@ -1646,7 +1646,7 @@
           <w:sz w:val="20"/>
           <w:szCs w:val="20"/>
         </w:rPr>
-        <w:t xml:space="preserve">  |  2024 – Present</w:t>
+        <w:t xml:space="preserve">  |  2024 – 31 Jan 2026</w:t>
       </w:r>
     </w:p>
     <w:p>
@@ -1901,7 +1901,7 @@
           <w:sz w:val="20"/>
           <w:szCs w:val="20"/>
         </w:rPr>
-        <w:t xml:space="preserve">  |  Jun 2024 – Present</w:t>
+        <w:t xml:space="preserve">  |  Jun 2024 – 31 Jan 2026</w:t>
       </w:r>
     </w:p>
     <w:p>

</xml_diff>

<commit_message>
feat: Add remote work experience bullet point and improve tagline formatting in resume.
</commit_message>
<xml_diff>
--- a/output/KiranTilekar_SpringBoot_3.3Yrs.docx
+++ b/output/KiranTilekar_SpringBoot_3.3Yrs.docx
@@ -31,7 +31,19 @@
           <w:sz w:val="20"/>
           <w:szCs w:val="20"/>
         </w:rPr>
-        <w:t xml:space="preserve">Senior Java Developer | Spring Boot 3.x | Monolithic Architecture | 99.9% Uptime | Rs.156Cr+ Systems | 3.3+ Yrs | Immediate Joiner</w:t>
+        <w:t xml:space="preserve">Senior Java Developer | Spring Boot 3.x | Monolithic Architecture</w:t>
+      </w:r>
+      <w:r>
+        <w:rPr>
+          <w:rFonts w:ascii="Calibri" w:cs="Calibri" w:eastAsia="Calibri" w:hAnsi="Calibri"/>
+          <w:i/>
+          <w:iCs/>
+          <w:color w:val="8F0D0D"/>
+          <w:sz w:val="20"/>
+          <w:szCs w:val="20"/>
+        </w:rPr>
+        <w:br/>
+        <w:t xml:space="preserve">99.9% Uptime | Rs.156Cr+ Systems | 3.3+ Yrs | Immediate Joiner</w:t>
       </w:r>
     </w:p>
     <w:p>
@@ -862,6 +874,56 @@
           <w:szCs w:val="20"/>
         </w:rPr>
         <w:t xml:space="preserve"> to mid-level</w:t>
+      </w:r>
+    </w:p>
+    <w:p>
+      <w:pPr>
+        <w:pStyle w:val="ListParagraph"/>
+        <w:numPr>
+          <w:ilvl w:val="0"/>
+          <w:numId w:val="1"/>
+        </w:numPr>
+        <w:spacing w:before="20" w:after="20"/>
+      </w:pPr>
+      <w:r>
+        <w:rPr>
+          <w:rFonts w:ascii="Calibri" w:cs="Calibri" w:eastAsia="Calibri" w:hAnsi="Calibri"/>
+          <w:b/>
+          <w:bCs/>
+          <w:color w:val="2E2E2E"/>
+          <w:sz w:val="20"/>
+          <w:szCs w:val="20"/>
+        </w:rPr>
+        <w:t xml:space="preserve">Remote Work Excellence: </w:t>
+      </w:r>
+      <w:r>
+        <w:rPr>
+          <w:rFonts w:ascii="Calibri" w:cs="Calibri" w:eastAsia="Calibri" w:hAnsi="Calibri"/>
+          <w:color w:val="666666"/>
+          <w:sz w:val="20"/>
+          <w:szCs w:val="20"/>
+        </w:rPr>
+        <w:t xml:space="preserve">Successfully delivered high-quality code and collaborated with cross-functional teams in a </w:t>
+      </w:r>
+      <w:r>
+        <w:rPr>
+          <w:rFonts w:ascii="Calibri" w:cs="Calibri" w:eastAsia="Calibri" w:hAnsi="Calibri"/>
+          <w:b/>
+          <w:bCs/>
+          <w:color w:val="2E2E2E"/>
+          <w:sz w:val="20"/>
+          <w:szCs w:val="20"/>
+        </w:rPr>
+        <w:t xml:space="preserve">100% remote environment</w:t>
+      </w:r>
+      <w:r>
+        <w:rPr>
+          <w:rFonts w:ascii="Calibri" w:cs="Calibri" w:eastAsia="Calibri" w:hAnsi="Calibri"/>
+          <w:color w:val="666666"/>
+          <w:sz w:val="20"/>
+          <w:szCs w:val="20"/>
+        </w:rPr>
+        <w:t xml:space="preserve">.</w:t>
       </w:r>
     </w:p>
     <w:p>

</xml_diff>

<commit_message>
feat: Add agile leadership experience and Jira/Confluence skills to the resume.
</commit_message>
<xml_diff>
--- a/output/KiranTilekar_SpringBoot_3.3Yrs.docx
+++ b/output/KiranTilekar_SpringBoot_3.3Yrs.docx
@@ -928,6 +928,96 @@
     </w:p>
     <w:p>
       <w:pPr>
+        <w:pStyle w:val="ListParagraph"/>
+        <w:numPr>
+          <w:ilvl w:val="0"/>
+          <w:numId w:val="1"/>
+        </w:numPr>
+        <w:spacing w:before="20" w:after="20"/>
+      </w:pPr>
+      <w:r>
+        <w:rPr>
+          <w:rFonts w:ascii="Calibri" w:cs="Calibri" w:eastAsia="Calibri" w:hAnsi="Calibri"/>
+          <w:b/>
+          <w:bCs/>
+          <w:color w:val="2E2E2E"/>
+          <w:sz w:val="20"/>
+          <w:szCs w:val="20"/>
+        </w:rPr>
+        <w:t xml:space="preserve">Agile Leadership: </w:t>
+      </w:r>
+      <w:r>
+        <w:rPr>
+          <w:rFonts w:ascii="Calibri" w:cs="Calibri" w:eastAsia="Calibri" w:hAnsi="Calibri"/>
+          <w:color w:val="666666"/>
+          <w:sz w:val="20"/>
+          <w:szCs w:val="20"/>
+        </w:rPr>
+        <w:t xml:space="preserve">Managed </w:t>
+      </w:r>
+      <w:r>
+        <w:rPr>
+          <w:rFonts w:ascii="Calibri" w:cs="Calibri" w:eastAsia="Calibri" w:hAnsi="Calibri"/>
+          <w:b/>
+          <w:bCs/>
+          <w:color w:val="2E2E2E"/>
+          <w:sz w:val="20"/>
+          <w:szCs w:val="20"/>
+        </w:rPr>
+        <w:t xml:space="preserve">Sprint workflows</w:t>
+      </w:r>
+      <w:r>
+        <w:rPr>
+          <w:rFonts w:ascii="Calibri" w:cs="Calibri" w:eastAsia="Calibri" w:hAnsi="Calibri"/>
+          <w:color w:val="666666"/>
+          <w:sz w:val="20"/>
+          <w:szCs w:val="20"/>
+        </w:rPr>
+        <w:t xml:space="preserve"> and documentation using </w:t>
+      </w:r>
+      <w:r>
+        <w:rPr>
+          <w:rFonts w:ascii="Calibri" w:cs="Calibri" w:eastAsia="Calibri" w:hAnsi="Calibri"/>
+          <w:b/>
+          <w:bCs/>
+          <w:color w:val="2E2E2E"/>
+          <w:sz w:val="20"/>
+          <w:szCs w:val="20"/>
+        </w:rPr>
+        <w:t xml:space="preserve">Jira &amp; Confluence</w:t>
+      </w:r>
+      <w:r>
+        <w:rPr>
+          <w:rFonts w:ascii="Calibri" w:cs="Calibri" w:eastAsia="Calibri" w:hAnsi="Calibri"/>
+          <w:color w:val="666666"/>
+          <w:sz w:val="20"/>
+          <w:szCs w:val="20"/>
+        </w:rPr>
+        <w:t xml:space="preserve">, ensuring </w:t>
+      </w:r>
+      <w:r>
+        <w:rPr>
+          <w:rFonts w:ascii="Calibri" w:cs="Calibri" w:eastAsia="Calibri" w:hAnsi="Calibri"/>
+          <w:b/>
+          <w:bCs/>
+          <w:color w:val="2E2E2E"/>
+          <w:sz w:val="20"/>
+          <w:szCs w:val="20"/>
+        </w:rPr>
+        <w:t xml:space="preserve">on-time delivery</w:t>
+      </w:r>
+      <w:r>
+        <w:rPr>
+          <w:rFonts w:ascii="Calibri" w:cs="Calibri" w:eastAsia="Calibri" w:hAnsi="Calibri"/>
+          <w:color w:val="666666"/>
+          <w:sz w:val="20"/>
+          <w:szCs w:val="20"/>
+        </w:rPr>
+        <w:t xml:space="preserve"> of features.</w:t>
+      </w:r>
+    </w:p>
+    <w:p>
+      <w:pPr>
         <w:pBdr>
           <w:bottom w:val="single" w:color="CCCCCC" w:sz="1" w:space="4"/>
         </w:pBdr>
@@ -3690,6 +3780,44 @@
           <w:bdr w:val="single" w:color="CCCCCC" w:sz="1" w:space="1"/>
         </w:rPr>
         <w:t xml:space="preserve"> GitHub Copilot </w:t>
+      </w:r>
+      <w:r>
+        <w:rPr>
+          <w:rFonts w:ascii="Calibri" w:cs="Calibri" w:eastAsia="Calibri" w:hAnsi="Calibri"/>
+          <w:color w:val="666666"/>
+          <w:sz w:val="18"/>
+          <w:szCs w:val="18"/>
+        </w:rPr>
+        <w:t xml:space="preserve">  </w:t>
+      </w:r>
+      <w:r>
+        <w:rPr>
+          <w:rFonts w:ascii="Calibri" w:cs="Calibri" w:eastAsia="Calibri" w:hAnsi="Calibri"/>
+          <w:color w:val="450808"/>
+          <w:sz w:val="18"/>
+          <w:szCs w:val="18"/>
+          <w:bdr w:val="single" w:color="CCCCCC" w:sz="1" w:space="1"/>
+        </w:rPr>
+        <w:t xml:space="preserve"> Jira </w:t>
+      </w:r>
+      <w:r>
+        <w:rPr>
+          <w:rFonts w:ascii="Calibri" w:cs="Calibri" w:eastAsia="Calibri" w:hAnsi="Calibri"/>
+          <w:color w:val="666666"/>
+          <w:sz w:val="18"/>
+          <w:szCs w:val="18"/>
+        </w:rPr>
+        <w:t xml:space="preserve">  </w:t>
+      </w:r>
+      <w:r>
+        <w:rPr>
+          <w:rFonts w:ascii="Calibri" w:cs="Calibri" w:eastAsia="Calibri" w:hAnsi="Calibri"/>
+          <w:color w:val="450808"/>
+          <w:sz w:val="18"/>
+          <w:szCs w:val="18"/>
+          <w:bdr w:val="single" w:color="CCCCCC" w:sz="1" w:space="1"/>
+        </w:rPr>
+        <w:t xml:space="preserve"> Confluence </w:t>
       </w:r>
       <w:r>
         <w:rPr>

</xml_diff>

<commit_message>
feat: update resume content by adding new technical experience details and removing the achievements section.
</commit_message>
<xml_diff>
--- a/output/KiranTilekar_SpringBoot_3.3Yrs.docx
+++ b/output/KiranTilekar_SpringBoot_3.3Yrs.docx
@@ -1018,6 +1018,366 @@
     </w:p>
     <w:p>
       <w:pPr>
+        <w:pStyle w:val="ListParagraph"/>
+        <w:numPr>
+          <w:ilvl w:val="0"/>
+          <w:numId w:val="1"/>
+        </w:numPr>
+        <w:spacing w:before="20" w:after="20"/>
+      </w:pPr>
+      <w:r>
+        <w:rPr>
+          <w:rFonts w:ascii="Calibri" w:cs="Calibri" w:eastAsia="Calibri" w:hAnsi="Calibri"/>
+          <w:b/>
+          <w:bCs/>
+          <w:color w:val="2E2E2E"/>
+          <w:sz w:val="20"/>
+          <w:szCs w:val="20"/>
+        </w:rPr>
+        <w:t xml:space="preserve">AI-Assisted Development: </w:t>
+      </w:r>
+      <w:r>
+        <w:rPr>
+          <w:rFonts w:ascii="Calibri" w:cs="Calibri" w:eastAsia="Calibri" w:hAnsi="Calibri"/>
+          <w:color w:val="666666"/>
+          <w:sz w:val="20"/>
+          <w:szCs w:val="20"/>
+        </w:rPr>
+        <w:t xml:space="preserve">Leveraged </w:t>
+      </w:r>
+      <w:r>
+        <w:rPr>
+          <w:rFonts w:ascii="Calibri" w:cs="Calibri" w:eastAsia="Calibri" w:hAnsi="Calibri"/>
+          <w:b/>
+          <w:bCs/>
+          <w:color w:val="2E2E2E"/>
+          <w:sz w:val="20"/>
+          <w:szCs w:val="20"/>
+        </w:rPr>
+        <w:t xml:space="preserve">GitHub Copilot</w:t>
+      </w:r>
+      <w:r>
+        <w:rPr>
+          <w:rFonts w:ascii="Calibri" w:cs="Calibri" w:eastAsia="Calibri" w:hAnsi="Calibri"/>
+          <w:color w:val="666666"/>
+          <w:sz w:val="20"/>
+          <w:szCs w:val="20"/>
+        </w:rPr>
+        <w:t xml:space="preserve"> to accelerate boilerplate code generation, reducing development time by </w:t>
+      </w:r>
+      <w:r>
+        <w:rPr>
+          <w:rFonts w:ascii="Calibri" w:cs="Calibri" w:eastAsia="Calibri" w:hAnsi="Calibri"/>
+          <w:b/>
+          <w:bCs/>
+          <w:color w:val="2E2E2E"/>
+          <w:sz w:val="20"/>
+          <w:szCs w:val="20"/>
+        </w:rPr>
+        <w:t xml:space="preserve">30%</w:t>
+      </w:r>
+      <w:r>
+        <w:rPr>
+          <w:rFonts w:ascii="Calibri" w:cs="Calibri" w:eastAsia="Calibri" w:hAnsi="Calibri"/>
+          <w:color w:val="666666"/>
+          <w:sz w:val="20"/>
+          <w:szCs w:val="20"/>
+        </w:rPr>
+        <w:t xml:space="preserve"> for standard CRUD modules.</w:t>
+      </w:r>
+    </w:p>
+    <w:p>
+      <w:pPr>
+        <w:pStyle w:val="ListParagraph"/>
+        <w:numPr>
+          <w:ilvl w:val="0"/>
+          <w:numId w:val="1"/>
+        </w:numPr>
+        <w:spacing w:before="20" w:after="20"/>
+      </w:pPr>
+      <w:r>
+        <w:rPr>
+          <w:rFonts w:ascii="Calibri" w:cs="Calibri" w:eastAsia="Calibri" w:hAnsi="Calibri"/>
+          <w:b/>
+          <w:bCs/>
+          <w:color w:val="2E2E2E"/>
+          <w:sz w:val="20"/>
+          <w:szCs w:val="20"/>
+        </w:rPr>
+        <w:t xml:space="preserve">Test-Driven Development: </w:t>
+      </w:r>
+      <w:r>
+        <w:rPr>
+          <w:rFonts w:ascii="Calibri" w:cs="Calibri" w:eastAsia="Calibri" w:hAnsi="Calibri"/>
+          <w:color w:val="666666"/>
+          <w:sz w:val="20"/>
+          <w:szCs w:val="20"/>
+        </w:rPr>
+        <w:t xml:space="preserve">Enforced </w:t>
+      </w:r>
+      <w:r>
+        <w:rPr>
+          <w:rFonts w:ascii="Calibri" w:cs="Calibri" w:eastAsia="Calibri" w:hAnsi="Calibri"/>
+          <w:b/>
+          <w:bCs/>
+          <w:color w:val="2E2E2E"/>
+          <w:sz w:val="20"/>
+          <w:szCs w:val="20"/>
+        </w:rPr>
+        <w:t xml:space="preserve">TDD</w:t>
+      </w:r>
+      <w:r>
+        <w:rPr>
+          <w:rFonts w:ascii="Calibri" w:cs="Calibri" w:eastAsia="Calibri" w:hAnsi="Calibri"/>
+          <w:color w:val="666666"/>
+          <w:sz w:val="20"/>
+          <w:szCs w:val="20"/>
+        </w:rPr>
+        <w:t xml:space="preserve"> using </w:t>
+      </w:r>
+      <w:r>
+        <w:rPr>
+          <w:rFonts w:ascii="Calibri" w:cs="Calibri" w:eastAsia="Calibri" w:hAnsi="Calibri"/>
+          <w:b/>
+          <w:bCs/>
+          <w:color w:val="2E2E2E"/>
+          <w:sz w:val="20"/>
+          <w:szCs w:val="20"/>
+        </w:rPr>
+        <w:t xml:space="preserve">JUnit 5 &amp; Mockito</w:t>
+      </w:r>
+      <w:r>
+        <w:rPr>
+          <w:rFonts w:ascii="Calibri" w:cs="Calibri" w:eastAsia="Calibri" w:hAnsi="Calibri"/>
+          <w:color w:val="666666"/>
+          <w:sz w:val="20"/>
+          <w:szCs w:val="20"/>
+        </w:rPr>
+        <w:t xml:space="preserve">, achieving </w:t>
+      </w:r>
+      <w:r>
+        <w:rPr>
+          <w:rFonts w:ascii="Calibri" w:cs="Calibri" w:eastAsia="Calibri" w:hAnsi="Calibri"/>
+          <w:b/>
+          <w:bCs/>
+          <w:color w:val="2E2E2E"/>
+          <w:sz w:val="20"/>
+          <w:szCs w:val="20"/>
+        </w:rPr>
+        <w:t xml:space="preserve">85%+ code coverage</w:t>
+      </w:r>
+      <w:r>
+        <w:rPr>
+          <w:rFonts w:ascii="Calibri" w:cs="Calibri" w:eastAsia="Calibri" w:hAnsi="Calibri"/>
+          <w:color w:val="666666"/>
+          <w:sz w:val="20"/>
+          <w:szCs w:val="20"/>
+        </w:rPr>
+        <w:t xml:space="preserve"> and reducing post-production bugs by </w:t>
+      </w:r>
+      <w:r>
+        <w:rPr>
+          <w:rFonts w:ascii="Calibri" w:cs="Calibri" w:eastAsia="Calibri" w:hAnsi="Calibri"/>
+          <w:b/>
+          <w:bCs/>
+          <w:color w:val="2E2E2E"/>
+          <w:sz w:val="20"/>
+          <w:szCs w:val="20"/>
+        </w:rPr>
+        <w:t xml:space="preserve">40%</w:t>
+      </w:r>
+      <w:r>
+        <w:rPr>
+          <w:rFonts w:ascii="Calibri" w:cs="Calibri" w:eastAsia="Calibri" w:hAnsi="Calibri"/>
+          <w:color w:val="666666"/>
+          <w:sz w:val="20"/>
+          <w:szCs w:val="20"/>
+        </w:rPr>
+        <w:t xml:space="preserve">.</w:t>
+      </w:r>
+    </w:p>
+    <w:p>
+      <w:pPr>
+        <w:pStyle w:val="ListParagraph"/>
+        <w:numPr>
+          <w:ilvl w:val="0"/>
+          <w:numId w:val="1"/>
+        </w:numPr>
+        <w:spacing w:before="20" w:after="20"/>
+      </w:pPr>
+      <w:r>
+        <w:rPr>
+          <w:rFonts w:ascii="Calibri" w:cs="Calibri" w:eastAsia="Calibri" w:hAnsi="Calibri"/>
+          <w:b/>
+          <w:bCs/>
+          <w:color w:val="2E2E2E"/>
+          <w:sz w:val="20"/>
+          <w:szCs w:val="20"/>
+        </w:rPr>
+        <w:t xml:space="preserve">API Standardization: </w:t>
+      </w:r>
+      <w:r>
+        <w:rPr>
+          <w:rFonts w:ascii="Calibri" w:cs="Calibri" w:eastAsia="Calibri" w:hAnsi="Calibri"/>
+          <w:color w:val="666666"/>
+          <w:sz w:val="20"/>
+          <w:szCs w:val="20"/>
+        </w:rPr>
+        <w:t xml:space="preserve">Standardized API documentation using </w:t>
+      </w:r>
+      <w:r>
+        <w:rPr>
+          <w:rFonts w:ascii="Calibri" w:cs="Calibri" w:eastAsia="Calibri" w:hAnsi="Calibri"/>
+          <w:b/>
+          <w:bCs/>
+          <w:color w:val="2E2E2E"/>
+          <w:sz w:val="20"/>
+          <w:szCs w:val="20"/>
+        </w:rPr>
+        <w:t xml:space="preserve">Swagger/OpenAPI</w:t>
+      </w:r>
+      <w:r>
+        <w:rPr>
+          <w:rFonts w:ascii="Calibri" w:cs="Calibri" w:eastAsia="Calibri" w:hAnsi="Calibri"/>
+          <w:color w:val="666666"/>
+          <w:sz w:val="20"/>
+          <w:szCs w:val="20"/>
+        </w:rPr>
+        <w:t xml:space="preserve">, reducing frontend-backend integration friction and onboarding time for new developers by </w:t>
+      </w:r>
+      <w:r>
+        <w:rPr>
+          <w:rFonts w:ascii="Calibri" w:cs="Calibri" w:eastAsia="Calibri" w:hAnsi="Calibri"/>
+          <w:b/>
+          <w:bCs/>
+          <w:color w:val="2E2E2E"/>
+          <w:sz w:val="20"/>
+          <w:szCs w:val="20"/>
+        </w:rPr>
+        <w:t xml:space="preserve">20%</w:t>
+      </w:r>
+      <w:r>
+        <w:rPr>
+          <w:rFonts w:ascii="Calibri" w:cs="Calibri" w:eastAsia="Calibri" w:hAnsi="Calibri"/>
+          <w:color w:val="666666"/>
+          <w:sz w:val="20"/>
+          <w:szCs w:val="20"/>
+        </w:rPr>
+        <w:t xml:space="preserve">.</w:t>
+      </w:r>
+    </w:p>
+    <w:p>
+      <w:pPr>
+        <w:pStyle w:val="ListParagraph"/>
+        <w:numPr>
+          <w:ilvl w:val="0"/>
+          <w:numId w:val="1"/>
+        </w:numPr>
+        <w:spacing w:before="20" w:after="20"/>
+      </w:pPr>
+      <w:r>
+        <w:rPr>
+          <w:rFonts w:ascii="Calibri" w:cs="Calibri" w:eastAsia="Calibri" w:hAnsi="Calibri"/>
+          <w:b/>
+          <w:bCs/>
+          <w:color w:val="2E2E2E"/>
+          <w:sz w:val="20"/>
+          <w:szCs w:val="20"/>
+        </w:rPr>
+        <w:t xml:space="preserve">DevOps Automation: </w:t>
+      </w:r>
+      <w:r>
+        <w:rPr>
+          <w:rFonts w:ascii="Calibri" w:cs="Calibri" w:eastAsia="Calibri" w:hAnsi="Calibri"/>
+          <w:color w:val="666666"/>
+          <w:sz w:val="20"/>
+          <w:szCs w:val="20"/>
+        </w:rPr>
+        <w:t xml:space="preserve">Configured </w:t>
+      </w:r>
+      <w:r>
+        <w:rPr>
+          <w:rFonts w:ascii="Calibri" w:cs="Calibri" w:eastAsia="Calibri" w:hAnsi="Calibri"/>
+          <w:b/>
+          <w:bCs/>
+          <w:color w:val="2E2E2E"/>
+          <w:sz w:val="20"/>
+          <w:szCs w:val="20"/>
+        </w:rPr>
+        <w:t xml:space="preserve">CI/CD pipelines</w:t>
+      </w:r>
+      <w:r>
+        <w:rPr>
+          <w:rFonts w:ascii="Calibri" w:cs="Calibri" w:eastAsia="Calibri" w:hAnsi="Calibri"/>
+          <w:color w:val="666666"/>
+          <w:sz w:val="20"/>
+          <w:szCs w:val="20"/>
+        </w:rPr>
+        <w:t xml:space="preserve"> using </w:t>
+      </w:r>
+      <w:r>
+        <w:rPr>
+          <w:rFonts w:ascii="Calibri" w:cs="Calibri" w:eastAsia="Calibri" w:hAnsi="Calibri"/>
+          <w:b/>
+          <w:bCs/>
+          <w:color w:val="2E2E2E"/>
+          <w:sz w:val="20"/>
+          <w:szCs w:val="20"/>
+        </w:rPr>
+        <w:t xml:space="preserve">Jenkins/GitHub Actions</w:t>
+      </w:r>
+      <w:r>
+        <w:rPr>
+          <w:rFonts w:ascii="Calibri" w:cs="Calibri" w:eastAsia="Calibri" w:hAnsi="Calibri"/>
+          <w:color w:val="666666"/>
+          <w:sz w:val="20"/>
+          <w:szCs w:val="20"/>
+        </w:rPr>
+        <w:t xml:space="preserve"> to automate builds and deployments to </w:t>
+      </w:r>
+      <w:r>
+        <w:rPr>
+          <w:rFonts w:ascii="Calibri" w:cs="Calibri" w:eastAsia="Calibri" w:hAnsi="Calibri"/>
+          <w:b/>
+          <w:bCs/>
+          <w:color w:val="2E2E2E"/>
+          <w:sz w:val="20"/>
+          <w:szCs w:val="20"/>
+        </w:rPr>
+        <w:t xml:space="preserve">AWS EC2</w:t>
+      </w:r>
+      <w:r>
+        <w:rPr>
+          <w:rFonts w:ascii="Calibri" w:cs="Calibri" w:eastAsia="Calibri" w:hAnsi="Calibri"/>
+          <w:color w:val="666666"/>
+          <w:sz w:val="20"/>
+          <w:szCs w:val="20"/>
+        </w:rPr>
+        <w:t xml:space="preserve">, cutting deployment time from 1 hour to </w:t>
+      </w:r>
+      <w:r>
+        <w:rPr>
+          <w:rFonts w:ascii="Calibri" w:cs="Calibri" w:eastAsia="Calibri" w:hAnsi="Calibri"/>
+          <w:b/>
+          <w:bCs/>
+          <w:color w:val="2E2E2E"/>
+          <w:sz w:val="20"/>
+          <w:szCs w:val="20"/>
+        </w:rPr>
+        <w:t xml:space="preserve">10 minutes</w:t>
+      </w:r>
+      <w:r>
+        <w:rPr>
+          <w:rFonts w:ascii="Calibri" w:cs="Calibri" w:eastAsia="Calibri" w:hAnsi="Calibri"/>
+          <w:color w:val="666666"/>
+          <w:sz w:val="20"/>
+          <w:szCs w:val="20"/>
+        </w:rPr>
+        <w:t xml:space="preserve">.</w:t>
+      </w:r>
+    </w:p>
+    <w:p>
+      <w:pPr>
         <w:pBdr>
           <w:bottom w:val="single" w:color="CCCCCC" w:sz="1" w:space="4"/>
         </w:pBdr>
@@ -4365,7 +4725,7 @@
           <w:sz w:val="20"/>
           <w:szCs w:val="20"/>
         </w:rPr>
-        <w:t xml:space="preserve">  |  Certified</w:t>
+        <w:t xml:space="preserve">  |  2022</w:t>
       </w:r>
     </w:p>
     <w:p>
@@ -4385,100 +4745,6 @@
           <w:szCs w:val="20"/>
         </w:rPr>
         <w:t xml:space="preserve">Comprehensive training in Java, Spring Boot, Angular, and enterprise application development</w:t>
-      </w:r>
-    </w:p>
-    <w:p>
-      <w:pPr>
-        <w:pBdr>
-          <w:bottom w:val="single" w:color="E7D192" w:sz="6" w:space="4"/>
-        </w:pBdr>
-        <w:spacing w:before="200" w:after="60"/>
-      </w:pPr>
-      <w:r>
-        <w:rPr>
-          <w:rFonts w:ascii="Cambria" w:cs="Cambria" w:eastAsia="Cambria" w:hAnsi="Cambria"/>
-          <w:b/>
-          <w:bCs/>
-          <w:color w:val="450808"/>
-          <w:sz w:val="26"/>
-          <w:szCs w:val="26"/>
-        </w:rPr>
-        <w:t xml:space="preserve">ACHIEVEMENTS</w:t>
-      </w:r>
-    </w:p>
-    <w:p>
-      <w:pPr>
-        <w:spacing w:before="40" w:after="40"/>
-      </w:pPr>
-      <w:r>
-        <w:rPr>
-          <w:rFonts w:ascii="Calibri" w:cs="Calibri" w:eastAsia="Calibri" w:hAnsi="Calibri"/>
-          <w:b/>
-          <w:bCs/>
-          <w:color w:val="8F0D0D"/>
-          <w:sz w:val="20"/>
-          <w:szCs w:val="20"/>
-        </w:rPr>
-        <w:t xml:space="preserve">★ Zero Data Loss Record  </w:t>
-      </w:r>
-      <w:r>
-        <w:rPr>
-          <w:rFonts w:ascii="Calibri" w:cs="Calibri" w:eastAsia="Calibri" w:hAnsi="Calibri"/>
-          <w:color w:val="666666"/>
-          <w:sz w:val="20"/>
-          <w:szCs w:val="20"/>
-        </w:rPr>
-        <w:t xml:space="preserve">100% integrity across Rs.500+ Cr | 2+ years</w:t>
-      </w:r>
-    </w:p>
-    <w:p>
-      <w:pPr>
-        <w:spacing w:before="40" w:after="40"/>
-      </w:pPr>
-      <w:r>
-        <w:rPr>
-          <w:rFonts w:ascii="Calibri" w:cs="Calibri" w:eastAsia="Calibri" w:hAnsi="Calibri"/>
-          <w:b/>
-          <w:bCs/>
-          <w:color w:val="8F0D0D"/>
-          <w:sz w:val="20"/>
-          <w:szCs w:val="20"/>
-        </w:rPr>
-        <w:t xml:space="preserve">★ 30+ Hours/Week Saved  </w:t>
-      </w:r>
-      <w:r>
-        <w:rPr>
-          <w:rFonts w:ascii="Calibri" w:cs="Calibri" w:eastAsia="Calibri" w:hAnsi="Calibri"/>
-          <w:color w:val="666666"/>
-          <w:sz w:val="20"/>
-          <w:szCs w:val="20"/>
-        </w:rPr>
-        <w:t xml:space="preserve">Automated 20+ reports | Eliminated manual processing</w:t>
-      </w:r>
-    </w:p>
-    <w:p>
-      <w:pPr>
-        <w:spacing w:before="40" w:after="40"/>
-      </w:pPr>
-      <w:r>
-        <w:rPr>
-          <w:rFonts w:ascii="Calibri" w:cs="Calibri" w:eastAsia="Calibri" w:hAnsi="Calibri"/>
-          <w:b/>
-          <w:bCs/>
-          <w:color w:val="8F0D0D"/>
-          <w:sz w:val="20"/>
-          <w:szCs w:val="20"/>
-        </w:rPr>
-        <w:t xml:space="preserve">★ 3 Developers Promoted  </w:t>
-      </w:r>
-      <w:r>
-        <w:rPr>
-          <w:rFonts w:ascii="Calibri" w:cs="Calibri" w:eastAsia="Calibri" w:hAnsi="Calibri"/>
-          <w:color w:val="666666"/>
-          <w:sz w:val="20"/>
-          <w:szCs w:val="20"/>
-        </w:rPr>
-        <w:t xml:space="preserve">Mentored juniors to mid-level | Spring Boot mastery</w:t>
       </w:r>
     </w:p>
     <w:p>

</xml_diff>

<commit_message>
Update resume content to replace Docker with GitHub Actions and regenerate all output documents.
</commit_message>
<xml_diff>
--- a/output/KiranTilekar_SpringBoot_3.3Yrs.docx
+++ b/output/KiranTilekar_SpringBoot_3.3Yrs.docx
@@ -3861,25 +3861,6 @@
           <w:szCs w:val="18"/>
           <w:bdr w:val="single" w:color="CCCCCC" w:sz="1" w:space="1"/>
         </w:rPr>
-        <w:t xml:space="preserve"> Docker </w:t>
-      </w:r>
-      <w:r>
-        <w:rPr>
-          <w:rFonts w:ascii="Calibri" w:cs="Calibri" w:eastAsia="Calibri" w:hAnsi="Calibri"/>
-          <w:color w:val="666666"/>
-          <w:sz w:val="18"/>
-          <w:szCs w:val="18"/>
-        </w:rPr>
-        <w:t xml:space="preserve">  </w:t>
-      </w:r>
-      <w:r>
-        <w:rPr>
-          <w:rFonts w:ascii="Calibri" w:cs="Calibri" w:eastAsia="Calibri" w:hAnsi="Calibri"/>
-          <w:color w:val="450808"/>
-          <w:sz w:val="18"/>
-          <w:szCs w:val="18"/>
-          <w:bdr w:val="single" w:color="CCCCCC" w:sz="1" w:space="1"/>
-        </w:rPr>
         <w:t xml:space="preserve"> Jenkins </w:t>
       </w:r>
       <w:r>
@@ -3900,6 +3881,25 @@
           <w:bdr w:val="single" w:color="CCCCCC" w:sz="1" w:space="1"/>
         </w:rPr>
         <w:t xml:space="preserve"> Git/GitHub </w:t>
+      </w:r>
+      <w:r>
+        <w:rPr>
+          <w:rFonts w:ascii="Calibri" w:cs="Calibri" w:eastAsia="Calibri" w:hAnsi="Calibri"/>
+          <w:color w:val="666666"/>
+          <w:sz w:val="18"/>
+          <w:szCs w:val="18"/>
+        </w:rPr>
+        <w:t xml:space="preserve">  </w:t>
+      </w:r>
+      <w:r>
+        <w:rPr>
+          <w:rFonts w:ascii="Calibri" w:cs="Calibri" w:eastAsia="Calibri" w:hAnsi="Calibri"/>
+          <w:color w:val="450808"/>
+          <w:sz w:val="18"/>
+          <w:szCs w:val="18"/>
+          <w:bdr w:val="single" w:color="CCCCCC" w:sz="1" w:space="1"/>
+        </w:rPr>
+        <w:t xml:space="preserve"> GitHub Actions </w:t>
       </w:r>
       <w:r>
         <w:rPr>

</xml_diff>

<commit_message>
feat: Add Antigravity to AI-assisted coding tools in the resume documents and regenerate output files.
</commit_message>
<xml_diff>
--- a/output/KiranTilekar_SpringBoot_3.3Yrs.docx
+++ b/output/KiranTilekar_SpringBoot_3.3Yrs.docx
@@ -446,7 +446,47 @@
           <w:sz w:val="20"/>
           <w:szCs w:val="20"/>
         </w:rPr>
-        <w:t xml:space="preserve">AI-assisted coding (GitHub Copilot)</w:t>
+        <w:t xml:space="preserve">Git</w:t>
+      </w:r>
+      <w:r>
+        <w:rPr>
+          <w:rFonts w:ascii="Calibri" w:cs="Calibri" w:eastAsia="Calibri" w:hAnsi="Calibri"/>
+          <w:color w:val="666666"/>
+          <w:sz w:val="20"/>
+          <w:szCs w:val="20"/>
+        </w:rPr>
+        <w:t xml:space="preserve">, </w:t>
+      </w:r>
+      <w:r>
+        <w:rPr>
+          <w:rFonts w:ascii="Calibri" w:cs="Calibri" w:eastAsia="Calibri" w:hAnsi="Calibri"/>
+          <w:b/>
+          <w:bCs/>
+          <w:color w:val="2E2E2E"/>
+          <w:sz w:val="20"/>
+          <w:szCs w:val="20"/>
+        </w:rPr>
+        <w:t xml:space="preserve">GitHub</w:t>
+      </w:r>
+      <w:r>
+        <w:rPr>
+          <w:rFonts w:ascii="Calibri" w:cs="Calibri" w:eastAsia="Calibri" w:hAnsi="Calibri"/>
+          <w:color w:val="666666"/>
+          <w:sz w:val="20"/>
+          <w:szCs w:val="20"/>
+        </w:rPr>
+        <w:t xml:space="preserve">, and </w:t>
+      </w:r>
+      <w:r>
+        <w:rPr>
+          <w:rFonts w:ascii="Calibri" w:cs="Calibri" w:eastAsia="Calibri" w:hAnsi="Calibri"/>
+          <w:b/>
+          <w:bCs/>
+          <w:color w:val="2E2E2E"/>
+          <w:sz w:val="20"/>
+          <w:szCs w:val="20"/>
+        </w:rPr>
+        <w:t xml:space="preserve">AI-assisted coding (GitHub Copilot, Antigravity)</w:t>
       </w:r>
       <w:r>
         <w:rPr>
@@ -1054,7 +1094,7 @@
           <w:sz w:val="20"/>
           <w:szCs w:val="20"/>
         </w:rPr>
-        <w:t xml:space="preserve">GitHub Copilot</w:t>
+        <w:t xml:space="preserve">GitHub Copilot &amp; Antigravity</w:t>
       </w:r>
       <w:r>
         <w:rPr>
@@ -4140,6 +4180,25 @@
           <w:bdr w:val="single" w:color="CCCCCC" w:sz="1" w:space="1"/>
         </w:rPr>
         <w:t xml:space="preserve"> GitHub Copilot </w:t>
+      </w:r>
+      <w:r>
+        <w:rPr>
+          <w:rFonts w:ascii="Calibri" w:cs="Calibri" w:eastAsia="Calibri" w:hAnsi="Calibri"/>
+          <w:color w:val="666666"/>
+          <w:sz w:val="18"/>
+          <w:szCs w:val="18"/>
+        </w:rPr>
+        <w:t xml:space="preserve">  </w:t>
+      </w:r>
+      <w:r>
+        <w:rPr>
+          <w:rFonts w:ascii="Calibri" w:cs="Calibri" w:eastAsia="Calibri" w:hAnsi="Calibri"/>
+          <w:color w:val="450808"/>
+          <w:sz w:val="18"/>
+          <w:szCs w:val="18"/>
+          <w:bdr w:val="single" w:color="CCCCCC" w:sz="1" w:space="1"/>
+        </w:rPr>
+        <w:t xml:space="preserve"> Antigravity </w:t>
       </w:r>
       <w:r>
         <w:rPr>

</xml_diff>